<commit_message>
Address InComm M7 review: plan share, star position, redemption range, claims check
- Stars: accept plan-supplied eligible share (plan_eligible_share) and add
  a share sweep; at diabetes 40% value is ~$114/closure, break-even x1.38
- Stars: add value by contract star position from CMS 2026 data
  (config/cms_star_position_density.csv); only 3.5-star contracts can cross
  the 4-star boundary, downside protection documented as not modelled
- Redemption: label 0.988 as a cost ceiling (OTC activation, not redemption),
  report break-even as a 0.55-0.988 range, fix misleading comments
- Claims: rename to referential-integrity check; add record-level checker and
  fault-injection test (6 fault types, 100% recall, 0 false positives)
- Reports: new sections, InComm feedback table, rebuilt M7 shareable docs
- Tests: 4 new, 110 pass
</commit_message>
<xml_diff>
--- a/milestone7_shareables/Milestone 7 Claims Validation, Attribution and RAF.docx
+++ b/milestone7_shareables/Milestone 7 Claims Validation, Attribution and RAF.docx
@@ -23,7 +23,7 @@
         <w:rPr>
           <w:sz w:val="18"/>
         </w:rPr>
-        <w:t>Prepared by: KSU mHealth Research Lab   |   Date: 2026-10-02</w:t>
+        <w:t>Prepared by: KSU mHealth Research Lab   |   Date: 2026-10-10</w:t>
       </w:r>
     </w:p>
     <w:p>
@@ -39,12 +39,12 @@
         <w:pStyle w:val="Heading1"/>
       </w:pPr>
       <w:r>
-        <w:t>1. Claims validation of closures</w:t>
+        <w:t>1. Closure referential-integrity check (not an independent validation)</w:t>
       </w:r>
     </w:p>
     <w:p>
       <w:r>
-        <w:t>InComm export (synthetic; claim ids MOCK-CLM-*), not production data quality. Gaps sharing a claim map to the same HEDIS measure (e.g. DIAB_A1C_TEST and DIAB_BLOOD_SUGAR both -&gt; CDC-A1C), so measure value is de-duplicated across them.</w:t>
+        <w:t>Referential-integrity check on InComm's export (claim ids MOCK-CLM-*). Closure is derived from the same claim, so member, CPT, date and window agree by construction; 100% shows internal consistency, not clinical validity or production data quality. Gaps sharing a claim map to the same HEDIS measure (e.g. DIAB_A1C_TEST and DIAB_BLOOD_SUGAR both -&gt; CDC-A1C), so measure value is de-duplicated across them.</w:t>
       </w:r>
     </w:p>
     <w:tbl>
@@ -735,6 +735,372 @@
         <w:tc>
           <w:tcPr>
             <w:tcW w:type="dxa" w:w="1080"/>
+          </w:tcPr>
+          <w:p>
+            <w:r>
+              <w:t>0</w:t>
+            </w:r>
+          </w:p>
+        </w:tc>
+      </w:tr>
+    </w:tbl>
+    <w:p>
+      <w:r>
+        <w:t>Does the check work? Known faults were injected into clean synthetic closures and the checker was run on them (recall is the share flagged; the last row is the false-positive rate on untouched rows). This tests the check, not InComm's data.</w:t>
+      </w:r>
+    </w:p>
+    <w:tbl>
+      <w:tblPr>
+        <w:tblStyle w:val="LightGrid-Accent1"/>
+        <w:tblW w:type="auto" w:w="0"/>
+        <w:tblLook w:firstColumn="1" w:firstRow="1" w:lastColumn="0" w:lastRow="0" w:noHBand="0" w:noVBand="1" w:val="04A0"/>
+      </w:tblPr>
+      <w:tblGrid>
+        <w:gridCol w:w="2160"/>
+        <w:gridCol w:w="2160"/>
+        <w:gridCol w:w="2160"/>
+        <w:gridCol w:w="2160"/>
+      </w:tblGrid>
+      <w:tr>
+        <w:tc>
+          <w:tcPr>
+            <w:tcW w:type="dxa" w:w="2160"/>
+          </w:tcPr>
+          <w:p>
+            <w:r>
+              <w:rPr>
+                <w:b/>
+              </w:rPr>
+              <w:t>Fault</w:t>
+            </w:r>
+          </w:p>
+        </w:tc>
+        <w:tc>
+          <w:tcPr>
+            <w:tcW w:type="dxa" w:w="2160"/>
+          </w:tcPr>
+          <w:p>
+            <w:r>
+              <w:rPr>
+                <w:b/>
+              </w:rPr>
+              <w:t>Injected</w:t>
+            </w:r>
+          </w:p>
+        </w:tc>
+        <w:tc>
+          <w:tcPr>
+            <w:tcW w:type="dxa" w:w="2160"/>
+          </w:tcPr>
+          <w:p>
+            <w:r>
+              <w:rPr>
+                <w:b/>
+              </w:rPr>
+              <w:t>Detected</w:t>
+            </w:r>
+          </w:p>
+        </w:tc>
+        <w:tc>
+          <w:tcPr>
+            <w:tcW w:type="dxa" w:w="2160"/>
+          </w:tcPr>
+          <w:p>
+            <w:r>
+              <w:rPr>
+                <w:b/>
+              </w:rPr>
+              <w:t>Recall</w:t>
+            </w:r>
+          </w:p>
+        </w:tc>
+      </w:tr>
+      <w:tr>
+        <w:tc>
+          <w:tcPr>
+            <w:tcW w:type="dxa" w:w="2160"/>
+          </w:tcPr>
+          <w:p>
+            <w:r>
+              <w:t>missing_claim</w:t>
+            </w:r>
+          </w:p>
+        </w:tc>
+        <w:tc>
+          <w:tcPr>
+            <w:tcW w:type="dxa" w:w="2160"/>
+          </w:tcPr>
+          <w:p>
+            <w:r>
+              <w:t>150</w:t>
+            </w:r>
+          </w:p>
+        </w:tc>
+        <w:tc>
+          <w:tcPr>
+            <w:tcW w:type="dxa" w:w="2160"/>
+          </w:tcPr>
+          <w:p>
+            <w:r>
+              <w:t>150</w:t>
+            </w:r>
+          </w:p>
+        </w:tc>
+        <w:tc>
+          <w:tcPr>
+            <w:tcW w:type="dxa" w:w="2160"/>
+          </w:tcPr>
+          <w:p>
+            <w:r>
+              <w:t>1.0000</w:t>
+            </w:r>
+          </w:p>
+        </w:tc>
+      </w:tr>
+      <w:tr>
+        <w:tc>
+          <w:tcPr>
+            <w:tcW w:type="dxa" w:w="2160"/>
+          </w:tcPr>
+          <w:p>
+            <w:r>
+              <w:t>wrong_member</w:t>
+            </w:r>
+          </w:p>
+        </w:tc>
+        <w:tc>
+          <w:tcPr>
+            <w:tcW w:type="dxa" w:w="2160"/>
+          </w:tcPr>
+          <w:p>
+            <w:r>
+              <w:t>150</w:t>
+            </w:r>
+          </w:p>
+        </w:tc>
+        <w:tc>
+          <w:tcPr>
+            <w:tcW w:type="dxa" w:w="2160"/>
+          </w:tcPr>
+          <w:p>
+            <w:r>
+              <w:t>150</w:t>
+            </w:r>
+          </w:p>
+        </w:tc>
+        <w:tc>
+          <w:tcPr>
+            <w:tcW w:type="dxa" w:w="2160"/>
+          </w:tcPr>
+          <w:p>
+            <w:r>
+              <w:t>1.0000</w:t>
+            </w:r>
+          </w:p>
+        </w:tc>
+      </w:tr>
+      <w:tr>
+        <w:tc>
+          <w:tcPr>
+            <w:tcW w:type="dxa" w:w="2160"/>
+          </w:tcPr>
+          <w:p>
+            <w:r>
+              <w:t>wrong_cpt</w:t>
+            </w:r>
+          </w:p>
+        </w:tc>
+        <w:tc>
+          <w:tcPr>
+            <w:tcW w:type="dxa" w:w="2160"/>
+          </w:tcPr>
+          <w:p>
+            <w:r>
+              <w:t>150</w:t>
+            </w:r>
+          </w:p>
+        </w:tc>
+        <w:tc>
+          <w:tcPr>
+            <w:tcW w:type="dxa" w:w="2160"/>
+          </w:tcPr>
+          <w:p>
+            <w:r>
+              <w:t>150</w:t>
+            </w:r>
+          </w:p>
+        </w:tc>
+        <w:tc>
+          <w:tcPr>
+            <w:tcW w:type="dxa" w:w="2160"/>
+          </w:tcPr>
+          <w:p>
+            <w:r>
+              <w:t>1.0000</w:t>
+            </w:r>
+          </w:p>
+        </w:tc>
+      </w:tr>
+      <w:tr>
+        <w:tc>
+          <w:tcPr>
+            <w:tcW w:type="dxa" w:w="2160"/>
+          </w:tcPr>
+          <w:p>
+            <w:r>
+              <w:t>shifted_date</w:t>
+            </w:r>
+          </w:p>
+        </w:tc>
+        <w:tc>
+          <w:tcPr>
+            <w:tcW w:type="dxa" w:w="2160"/>
+          </w:tcPr>
+          <w:p>
+            <w:r>
+              <w:t>150</w:t>
+            </w:r>
+          </w:p>
+        </w:tc>
+        <w:tc>
+          <w:tcPr>
+            <w:tcW w:type="dxa" w:w="2160"/>
+          </w:tcPr>
+          <w:p>
+            <w:r>
+              <w:t>150</w:t>
+            </w:r>
+          </w:p>
+        </w:tc>
+        <w:tc>
+          <w:tcPr>
+            <w:tcW w:type="dxa" w:w="2160"/>
+          </w:tcPr>
+          <w:p>
+            <w:r>
+              <w:t>1.0000</w:t>
+            </w:r>
+          </w:p>
+        </w:tc>
+      </w:tr>
+      <w:tr>
+        <w:tc>
+          <w:tcPr>
+            <w:tcW w:type="dxa" w:w="2160"/>
+          </w:tcPr>
+          <w:p>
+            <w:r>
+              <w:t>out_of_window</w:t>
+            </w:r>
+          </w:p>
+        </w:tc>
+        <w:tc>
+          <w:tcPr>
+            <w:tcW w:type="dxa" w:w="2160"/>
+          </w:tcPr>
+          <w:p>
+            <w:r>
+              <w:t>150</w:t>
+            </w:r>
+          </w:p>
+        </w:tc>
+        <w:tc>
+          <w:tcPr>
+            <w:tcW w:type="dxa" w:w="2160"/>
+          </w:tcPr>
+          <w:p>
+            <w:r>
+              <w:t>150</w:t>
+            </w:r>
+          </w:p>
+        </w:tc>
+        <w:tc>
+          <w:tcPr>
+            <w:tcW w:type="dxa" w:w="2160"/>
+          </w:tcPr>
+          <w:p>
+            <w:r>
+              <w:t>1.0000</w:t>
+            </w:r>
+          </w:p>
+        </w:tc>
+      </w:tr>
+      <w:tr>
+        <w:tc>
+          <w:tcPr>
+            <w:tcW w:type="dxa" w:w="2160"/>
+          </w:tcPr>
+          <w:p>
+            <w:r>
+              <w:t>claim_reused_across_members</w:t>
+            </w:r>
+          </w:p>
+        </w:tc>
+        <w:tc>
+          <w:tcPr>
+            <w:tcW w:type="dxa" w:w="2160"/>
+          </w:tcPr>
+          <w:p>
+            <w:r>
+              <w:t>150</w:t>
+            </w:r>
+          </w:p>
+        </w:tc>
+        <w:tc>
+          <w:tcPr>
+            <w:tcW w:type="dxa" w:w="2160"/>
+          </w:tcPr>
+          <w:p>
+            <w:r>
+              <w:t>150</w:t>
+            </w:r>
+          </w:p>
+        </w:tc>
+        <w:tc>
+          <w:tcPr>
+            <w:tcW w:type="dxa" w:w="2160"/>
+          </w:tcPr>
+          <w:p>
+            <w:r>
+              <w:t>1.0000</w:t>
+            </w:r>
+          </w:p>
+        </w:tc>
+      </w:tr>
+      <w:tr>
+        <w:tc>
+          <w:tcPr>
+            <w:tcW w:type="dxa" w:w="2160"/>
+          </w:tcPr>
+          <w:p>
+            <w:r>
+              <w:t>none (clean rows flagged = false positives)</w:t>
+            </w:r>
+          </w:p>
+        </w:tc>
+        <w:tc>
+          <w:tcPr>
+            <w:tcW w:type="dxa" w:w="2160"/>
+          </w:tcPr>
+          <w:p>
+            <w:r>
+              <w:t>2100</w:t>
+            </w:r>
+          </w:p>
+        </w:tc>
+        <w:tc>
+          <w:tcPr>
+            <w:tcW w:type="dxa" w:w="2160"/>
+          </w:tcPr>
+          <w:p>
+            <w:r>
+              <w:t>0</w:t>
+            </w:r>
+          </w:p>
+        </w:tc>
+        <w:tc>
+          <w:tcPr>
+            <w:tcW w:type="dxa" w:w="2160"/>
           </w:tcPr>
           <w:p>
             <w:r>

</xml_diff>